<commit_message>
fix: add @Spy mapper and identity map in service unit tests
</commit_message>
<xml_diff>
--- a/docs/12-final-report/Пояснительная записка.docx
+++ b/docs/12-final-report/Пояснительная записка.docx
@@ -58,25 +58,7 @@
           <w:szCs w:val="28"/>
           <w:lang w:eastAsia="ru-RU"/>
         </w:rPr>
-        <w:t>ФГАОУ ВО «</w:t>
-      </w:r>
-      <w:proofErr w:type="gramStart"/>
-      <w:r>
-        <w:rPr>
-          <w:rFonts w:eastAsia="Times New Roman" w:cs="Times New Roman"/>
-          <w:szCs w:val="28"/>
-          <w:lang w:eastAsia="ru-RU"/>
-        </w:rPr>
-        <w:t>СЕВЕРО-КАВКАЗСКИЙ ФЕДЕРАЛЬНЫЙ</w:t>
-      </w:r>
-      <w:proofErr w:type="gramEnd"/>
-      <w:r>
-        <w:rPr>
-          <w:rFonts w:eastAsia="Times New Roman" w:cs="Times New Roman"/>
-          <w:szCs w:val="28"/>
-          <w:lang w:eastAsia="ru-RU"/>
-        </w:rPr>
-        <w:t xml:space="preserve"> УНИВЕРСИТЕТ»</w:t>
+        <w:t>ФГАОУ ВО «СЕВЕРО-КАВКАЗСКИЙ ФЕДЕРАЛЬНЫЙ УНИВЕРСИТЕТ»</w:t>
       </w:r>
     </w:p>
     <w:p>
@@ -788,16 +770,7 @@
           <w:szCs w:val="28"/>
           <w:lang w:eastAsia="ru-RU"/>
         </w:rPr>
-        <w:t xml:space="preserve">защищена с </w:t>
-      </w:r>
-      <w:proofErr w:type="gramStart"/>
-      <w:r>
-        <w:rPr>
-          <w:rFonts w:eastAsia="Times New Roman" w:cs="Times New Roman"/>
-          <w:szCs w:val="28"/>
-          <w:lang w:eastAsia="ru-RU"/>
-        </w:rPr>
-        <w:t xml:space="preserve">оценкой  </w:t>
+        <w:t xml:space="preserve">защищена с оценкой  </w:t>
       </w:r>
       <w:r>
         <w:rPr>
@@ -806,14 +779,6 @@
           <w:lang w:eastAsia="ru-RU"/>
         </w:rPr>
         <w:tab/>
-      </w:r>
-      <w:proofErr w:type="gramEnd"/>
-      <w:r>
-        <w:rPr>
-          <w:rFonts w:eastAsia="Times New Roman" w:cs="Times New Roman"/>
-          <w:szCs w:val="28"/>
-          <w:lang w:eastAsia="ru-RU"/>
-        </w:rPr>
         <w:t>____________________</w:t>
       </w:r>
       <w:r>
@@ -851,16 +816,6 @@
         </w:rPr>
         <w:tab/>
       </w:r>
-    </w:p>
-    <w:p>
-      <w:pPr>
-        <w:spacing w:after="0" w:line="240" w:lineRule="auto"/>
-        <w:rPr>
-          <w:rFonts w:eastAsia="Times New Roman" w:cs="Times New Roman"/>
-          <w:szCs w:val="28"/>
-          <w:lang w:eastAsia="ru-RU"/>
-        </w:rPr>
-      </w:pPr>
       <w:bookmarkStart w:id="1" w:name="_GoBack"/>
       <w:bookmarkEnd w:id="1"/>
     </w:p>
@@ -1259,9 +1214,8 @@
           <w:u w:val="single"/>
           <w:lang w:eastAsia="ru-RU"/>
         </w:rPr>
-        <w:t xml:space="preserve">доцент </w:t>
-      </w:r>
-      <w:proofErr w:type="gramStart"/>
+        <w:t xml:space="preserve">доцент МИБК  </w:t>
+      </w:r>
       <w:r>
         <w:rPr>
           <w:rFonts w:eastAsia="Times New Roman" w:cs="Times New Roman"/>
@@ -1269,18 +1223,8 @@
           <w:u w:val="single"/>
           <w:lang w:eastAsia="ru-RU"/>
         </w:rPr>
-        <w:t xml:space="preserve">МИБК  </w:t>
-      </w:r>
-      <w:r>
-        <w:rPr>
-          <w:rFonts w:eastAsia="Times New Roman" w:cs="Times New Roman"/>
-          <w:szCs w:val="28"/>
-          <w:u w:val="single"/>
-          <w:lang w:eastAsia="ru-RU"/>
-        </w:rPr>
         <w:tab/>
       </w:r>
-      <w:proofErr w:type="gramEnd"/>
       <w:r>
         <w:rPr>
           <w:rFonts w:eastAsia="Times New Roman" w:cs="Times New Roman"/>
@@ -1419,7 +1363,6 @@
           <w:szCs w:val="28"/>
           <w:lang w:eastAsia="ru-RU"/>
         </w:rPr>
-        <w:lastRenderedPageBreak/>
         <w:t xml:space="preserve">Ставрополь, </w:t>
       </w:r>
       <w:r>
@@ -14860,19 +14803,11 @@
         </w:rPr>
         <w:t>«</w:t>
       </w:r>
-      <w:proofErr w:type="gramStart"/>
-      <w:r>
-        <w:rPr>
-          <w:lang w:eastAsia="ru-RU"/>
-        </w:rPr>
-        <w:t>CHECK &gt;</w:t>
-      </w:r>
-      <w:proofErr w:type="gramEnd"/>
-      <w:r>
-        <w:rPr>
-          <w:lang w:eastAsia="ru-RU"/>
-        </w:rPr>
-        <w:t>= 0</w:t>
+      <w:r>
+        <w:rPr>
+          <w:lang w:eastAsia="ru-RU"/>
+        </w:rPr>
+        <w:t>CHECK &gt;= 0</w:t>
       </w:r>
       <w:r>
         <w:rPr>
@@ -15172,19 +15107,11 @@
         </w:rPr>
         <w:t>«</w:t>
       </w:r>
-      <w:proofErr w:type="gramStart"/>
-      <w:r>
-        <w:rPr>
-          <w:lang w:eastAsia="ru-RU"/>
-        </w:rPr>
-        <w:t>CHECK &gt;</w:t>
-      </w:r>
-      <w:proofErr w:type="gramEnd"/>
-      <w:r>
-        <w:rPr>
-          <w:lang w:eastAsia="ru-RU"/>
-        </w:rPr>
-        <w:t>= 0</w:t>
+      <w:r>
+        <w:rPr>
+          <w:lang w:eastAsia="ru-RU"/>
+        </w:rPr>
+        <w:t>CHECK &gt;= 0</w:t>
       </w:r>
       <w:r>
         <w:rPr>
@@ -15402,21 +15329,7 @@
         <w:rPr>
           <w:lang w:val="en-US" w:eastAsia="ru-RU"/>
         </w:rPr>
-        <w:t xml:space="preserve"> (</w:t>
-      </w:r>
-      <w:proofErr w:type="gramStart"/>
-      <w:r>
-        <w:rPr>
-          <w:lang w:val="en-US" w:eastAsia="ru-RU"/>
-        </w:rPr>
-        <w:t>VARCHAR(</w:t>
-      </w:r>
-      <w:proofErr w:type="gramEnd"/>
-      <w:r>
-        <w:rPr>
-          <w:lang w:val="en-US" w:eastAsia="ru-RU"/>
-        </w:rPr>
-        <w:t>32), UNIQUE NOT NULL).</w:t>
+        <w:t xml:space="preserve"> (VARCHAR(32), UNIQUE NOT NULL).</w:t>
       </w:r>
     </w:p>
     <w:p>
@@ -15564,21 +15477,7 @@
         <w:rPr>
           <w:lang w:val="en-US" w:eastAsia="ru-RU"/>
         </w:rPr>
-        <w:t xml:space="preserve"> (</w:t>
-      </w:r>
-      <w:proofErr w:type="gramStart"/>
-      <w:r>
-        <w:rPr>
-          <w:lang w:val="en-US" w:eastAsia="ru-RU"/>
-        </w:rPr>
-        <w:t>VARCHAR(</w:t>
-      </w:r>
-      <w:proofErr w:type="gramEnd"/>
-      <w:r>
-        <w:rPr>
-          <w:lang w:val="en-US" w:eastAsia="ru-RU"/>
-        </w:rPr>
-        <w:t>64), UNIQUE NOT NULL).</w:t>
+        <w:t xml:space="preserve"> (VARCHAR(64), UNIQUE NOT NULL).</w:t>
       </w:r>
     </w:p>
     <w:p>
@@ -16316,21 +16215,7 @@
         <w:rPr>
           <w:lang w:val="en-US" w:eastAsia="ru-RU"/>
         </w:rPr>
-        <w:t xml:space="preserve"> (</w:t>
-      </w:r>
-      <w:proofErr w:type="gramStart"/>
-      <w:r>
-        <w:rPr>
-          <w:lang w:val="en-US" w:eastAsia="ru-RU"/>
-        </w:rPr>
-        <w:t>VARCHAR(</w:t>
-      </w:r>
-      <w:proofErr w:type="gramEnd"/>
-      <w:r>
-        <w:rPr>
-          <w:lang w:val="en-US" w:eastAsia="ru-RU"/>
-        </w:rPr>
-        <w:t>64), UNIQUE NOT NULL).</w:t>
+        <w:t xml:space="preserve"> (VARCHAR(64), UNIQUE NOT NULL).</w:t>
       </w:r>
     </w:p>
     <w:p>
@@ -16712,21 +16597,7 @@
         <w:rPr>
           <w:lang w:val="en-US" w:eastAsia="ru-RU"/>
         </w:rPr>
-        <w:t xml:space="preserve"> (</w:t>
-      </w:r>
-      <w:proofErr w:type="gramStart"/>
-      <w:r>
-        <w:rPr>
-          <w:lang w:val="en-US" w:eastAsia="ru-RU"/>
-        </w:rPr>
-        <w:t>VARCHAR(</w:t>
-      </w:r>
-      <w:proofErr w:type="gramEnd"/>
-      <w:r>
-        <w:rPr>
-          <w:lang w:val="en-US" w:eastAsia="ru-RU"/>
-        </w:rPr>
-        <w:t>64), UNIQUE NOT NULL).</w:t>
+        <w:t xml:space="preserve"> (VARCHAR(64), UNIQUE NOT NULL).</w:t>
       </w:r>
     </w:p>
     <w:p>
@@ -16910,21 +16781,7 @@
         <w:rPr>
           <w:lang w:val="en-US" w:eastAsia="ru-RU"/>
         </w:rPr>
-        <w:t xml:space="preserve"> (</w:t>
-      </w:r>
-      <w:proofErr w:type="gramStart"/>
-      <w:r>
-        <w:rPr>
-          <w:lang w:val="en-US" w:eastAsia="ru-RU"/>
-        </w:rPr>
-        <w:t>VARCHAR(</w:t>
-      </w:r>
-      <w:proofErr w:type="gramEnd"/>
-      <w:r>
-        <w:rPr>
-          <w:lang w:val="en-US" w:eastAsia="ru-RU"/>
-        </w:rPr>
-        <w:t xml:space="preserve">128), UNIQUE NOT NULL), </w:t>
+        <w:t xml:space="preserve"> (VARCHAR(128), UNIQUE NOT NULL), </w:t>
       </w:r>
       <w:r>
         <w:rPr>
@@ -17130,21 +16987,7 @@
         <w:rPr>
           <w:lang w:val="en-US" w:eastAsia="ru-RU"/>
         </w:rPr>
-        <w:t xml:space="preserve"> (</w:t>
-      </w:r>
-      <w:proofErr w:type="gramStart"/>
-      <w:r>
-        <w:rPr>
-          <w:lang w:val="en-US" w:eastAsia="ru-RU"/>
-        </w:rPr>
-        <w:t>VARCHAR(</w:t>
-      </w:r>
-      <w:proofErr w:type="gramEnd"/>
-      <w:r>
-        <w:rPr>
-          <w:lang w:val="en-US" w:eastAsia="ru-RU"/>
-        </w:rPr>
-        <w:t>64), UNIQUE NOT NULL).</w:t>
+        <w:t xml:space="preserve"> (VARCHAR(64), UNIQUE NOT NULL).</w:t>
       </w:r>
     </w:p>
     <w:p>
@@ -18625,21 +18468,7 @@
         <w:rPr>
           <w:lang w:eastAsia="ru-RU"/>
         </w:rPr>
-        <w:t>UC-1</w:t>
-      </w:r>
-      <w:proofErr w:type="gramStart"/>
-      <w:r>
-        <w:rPr>
-          <w:lang w:eastAsia="ru-RU"/>
-        </w:rPr>
-        <w:t>: Добавить</w:t>
-      </w:r>
-      <w:proofErr w:type="gramEnd"/>
-      <w:r>
-        <w:rPr>
-          <w:lang w:eastAsia="ru-RU"/>
-        </w:rPr>
-        <w:t xml:space="preserve"> материал. Пользователь открывает форму и заполняет поля (название, цена, единица измерения, группа). Контроллер проверяет наличие права доступа, выполняет валидацию входных данных и проверяет уникальность названия через сервис и репозиторий. При нарушении любого из условий форма возвращает сообщение об ошибке. В случае успеха сервис создаёт объект </w:t>
+        <w:t xml:space="preserve">UC-1: Добавить материал. Пользователь открывает форму и заполняет поля (название, цена, единица измерения, группа). Контроллер проверяет наличие права доступа, выполняет валидацию входных данных и проверяет уникальность названия через сервис и репозиторий. При нарушении любого из условий форма возвращает сообщение об ошибке. В случае успеха сервис создаёт объект </w:t>
       </w:r>
       <w:r>
         <w:rPr>
@@ -18833,21 +18662,7 @@
         <w:rPr>
           <w:lang w:eastAsia="ru-RU"/>
         </w:rPr>
-        <w:t>UC-2</w:t>
-      </w:r>
-      <w:proofErr w:type="gramStart"/>
-      <w:r>
-        <w:rPr>
-          <w:lang w:eastAsia="ru-RU"/>
-        </w:rPr>
-        <w:t>: Создать</w:t>
-      </w:r>
-      <w:proofErr w:type="gramEnd"/>
-      <w:r>
-        <w:rPr>
-          <w:lang w:eastAsia="ru-RU"/>
-        </w:rPr>
-        <w:t xml:space="preserve"> нового пользователя. При открытии формы контроллер запрашивает список доступных ролей из БД и передаёт их в форму. После заполнения полей (логин, пароль, имя, фамилия, роль) выполняется проверка прав, валидация и проверка уникальности логина. В случае успеха сервис </w:t>
+        <w:t xml:space="preserve">UC-2: Создать нового пользователя. При открытии формы контроллер запрашивает список доступных ролей из БД и передаёт их в форму. После заполнения полей (логин, пароль, имя, фамилия, роль) выполняется проверка прав, валидация и проверка уникальности логина. В случае успеха сервис </w:t>
       </w:r>
       <w:proofErr w:type="spellStart"/>
       <w:r>
@@ -19034,21 +18849,7 @@
         <w:rPr>
           <w:lang w:eastAsia="ru-RU"/>
         </w:rPr>
-        <w:t>UC-3</w:t>
-      </w:r>
-      <w:proofErr w:type="gramStart"/>
-      <w:r>
-        <w:rPr>
-          <w:lang w:eastAsia="ru-RU"/>
-        </w:rPr>
-        <w:t>: Создать</w:t>
-      </w:r>
-      <w:proofErr w:type="gramEnd"/>
-      <w:r>
-        <w:rPr>
-          <w:lang w:eastAsia="ru-RU"/>
-        </w:rPr>
-        <w:t xml:space="preserve"> новую роль. При открытии формы загружается полный список доступных прав (</w:t>
+        <w:t>UC-3: Создать новую роль. При открытии формы загружается полный список доступных прав (</w:t>
       </w:r>
       <w:r>
         <w:rPr>
@@ -20222,7 +20023,6 @@
         <w:t>«</w:t>
       </w:r>
       <w:proofErr w:type="spellStart"/>
-      <w:proofErr w:type="gramStart"/>
       <w:r>
         <w:rPr>
           <w:lang w:eastAsia="ru-RU"/>
@@ -20234,14 +20034,7 @@
         <w:rPr>
           <w:lang w:eastAsia="ru-RU"/>
         </w:rPr>
-        <w:t>(</w:t>
-      </w:r>
-      <w:proofErr w:type="gramEnd"/>
-      <w:r>
-        <w:rPr>
-          <w:lang w:eastAsia="ru-RU"/>
-        </w:rPr>
-        <w:t>)</w:t>
+        <w:t>()</w:t>
       </w:r>
       <w:r>
         <w:rPr>
@@ -20570,7 +20363,6 @@
         <w:t xml:space="preserve"> </w:t>
       </w:r>
       <w:proofErr w:type="spellStart"/>
-      <w:proofErr w:type="gramStart"/>
       <w:r>
         <w:rPr>
           <w:lang w:eastAsia="ru-RU"/>
@@ -20585,7 +20377,6 @@
         <w:t>(</w:t>
       </w:r>
       <w:proofErr w:type="spellStart"/>
-      <w:proofErr w:type="gramEnd"/>
       <w:r>
         <w:rPr>
           <w:lang w:eastAsia="ru-RU"/>
@@ -20803,23 +20594,13 @@
         <w:t xml:space="preserve">. Пакет </w:t>
       </w:r>
       <w:proofErr w:type="spellStart"/>
-      <w:proofErr w:type="gramStart"/>
-      <w:r>
-        <w:rPr>
-          <w:rFonts w:eastAsia="Times New Roman" w:cs="Times New Roman"/>
-          <w:szCs w:val="28"/>
-          <w:lang w:eastAsia="ru-RU"/>
-        </w:rPr>
-        <w:t>ru.denis</w:t>
-      </w:r>
-      <w:proofErr w:type="gramEnd"/>
-      <w:r>
-        <w:rPr>
-          <w:rFonts w:eastAsia="Times New Roman" w:cs="Times New Roman"/>
-          <w:szCs w:val="28"/>
-          <w:lang w:eastAsia="ru-RU"/>
-        </w:rPr>
-        <w:t>.Calculator</w:t>
+      <w:r>
+        <w:rPr>
+          <w:rFonts w:eastAsia="Times New Roman" w:cs="Times New Roman"/>
+          <w:szCs w:val="28"/>
+          <w:lang w:eastAsia="ru-RU"/>
+        </w:rPr>
+        <w:t>ru.denis.Calculator</w:t>
       </w:r>
       <w:proofErr w:type="spellEnd"/>
       <w:r>
@@ -21633,23 +21414,13 @@
         <w:t xml:space="preserve"> </w:t>
       </w:r>
       <w:proofErr w:type="spellStart"/>
-      <w:proofErr w:type="gramStart"/>
-      <w:r>
-        <w:rPr>
-          <w:rFonts w:eastAsia="Times New Roman" w:cs="Times New Roman"/>
-          <w:szCs w:val="28"/>
-          <w:lang w:val="en-US" w:eastAsia="ru-RU"/>
-        </w:rPr>
-        <w:t>ru.denis</w:t>
-      </w:r>
-      <w:proofErr w:type="gramEnd"/>
-      <w:r>
-        <w:rPr>
-          <w:rFonts w:eastAsia="Times New Roman" w:cs="Times New Roman"/>
-          <w:szCs w:val="28"/>
-          <w:lang w:val="en-US" w:eastAsia="ru-RU"/>
-        </w:rPr>
-        <w:t>.Calculator.Entity</w:t>
+      <w:r>
+        <w:rPr>
+          <w:rFonts w:eastAsia="Times New Roman" w:cs="Times New Roman"/>
+          <w:szCs w:val="28"/>
+          <w:lang w:val="en-US" w:eastAsia="ru-RU"/>
+        </w:rPr>
+        <w:t>ru.denis.Calculator.Entity</w:t>
       </w:r>
       <w:proofErr w:type="spellEnd"/>
       <w:r>
@@ -21757,7 +21528,6 @@
         <w:t>: @</w:t>
       </w:r>
       <w:proofErr w:type="spellStart"/>
-      <w:proofErr w:type="gramStart"/>
       <w:r>
         <w:rPr>
           <w:rFonts w:eastAsia="Times New Roman" w:cs="Times New Roman"/>
@@ -21773,16 +21543,7 @@
           <w:szCs w:val="28"/>
           <w:lang w:val="en-US" w:eastAsia="ru-RU"/>
         </w:rPr>
-        <w:t>(</w:t>
-      </w:r>
-      <w:proofErr w:type="gramEnd"/>
-      <w:r>
-        <w:rPr>
-          <w:rFonts w:eastAsia="Times New Roman" w:cs="Times New Roman"/>
-          <w:szCs w:val="28"/>
-          <w:lang w:val="en-US" w:eastAsia="ru-RU"/>
-        </w:rPr>
-        <w:t>IDENTITY).</w:t>
+        <w:t>(IDENTITY).</w:t>
       </w:r>
     </w:p>
     <w:p>
@@ -21916,7 +21677,6 @@
         <w:t xml:space="preserve"> @</w:t>
       </w:r>
       <w:proofErr w:type="spellStart"/>
-      <w:proofErr w:type="gramStart"/>
       <w:r>
         <w:rPr>
           <w:rFonts w:eastAsia="Times New Roman" w:cs="Times New Roman"/>
@@ -21932,16 +21692,7 @@
           <w:szCs w:val="28"/>
           <w:lang w:val="en-US" w:eastAsia="ru-RU"/>
         </w:rPr>
-        <w:t>(</w:t>
-      </w:r>
-      <w:proofErr w:type="gramEnd"/>
-      <w:r>
-        <w:rPr>
-          <w:rFonts w:eastAsia="Times New Roman" w:cs="Times New Roman"/>
-          <w:szCs w:val="28"/>
-          <w:lang w:val="en-US" w:eastAsia="ru-RU"/>
-        </w:rPr>
-        <w:t xml:space="preserve">LAZY). Formula </w:t>
+        <w:t xml:space="preserve">(LAZY). Formula </w:t>
       </w:r>
       <w:r>
         <w:rPr>
@@ -22383,23 +22134,13 @@
         <w:t xml:space="preserve"> Foundation (</w:t>
       </w:r>
       <w:proofErr w:type="spellStart"/>
-      <w:proofErr w:type="gramStart"/>
-      <w:r>
-        <w:rPr>
-          <w:rFonts w:eastAsia="Times New Roman" w:cs="Times New Roman"/>
-          <w:szCs w:val="28"/>
-          <w:lang w:val="en-US" w:eastAsia="ru-RU"/>
-        </w:rPr>
-        <w:t>ru.denis</w:t>
-      </w:r>
-      <w:proofErr w:type="gramEnd"/>
-      <w:r>
-        <w:rPr>
-          <w:rFonts w:eastAsia="Times New Roman" w:cs="Times New Roman"/>
-          <w:szCs w:val="28"/>
-          <w:lang w:val="en-US" w:eastAsia="ru-RU"/>
-        </w:rPr>
-        <w:t>.Calculator.Foundation</w:t>
+      <w:r>
+        <w:rPr>
+          <w:rFonts w:eastAsia="Times New Roman" w:cs="Times New Roman"/>
+          <w:szCs w:val="28"/>
+          <w:lang w:val="en-US" w:eastAsia="ru-RU"/>
+        </w:rPr>
+        <w:t>ru.denis.Calculator.Foundation</w:t>
       </w:r>
       <w:proofErr w:type="spellEnd"/>
       <w:r>
@@ -22630,7 +22371,6 @@
         <w:t xml:space="preserve">, </w:t>
       </w:r>
       <w:proofErr w:type="spellStart"/>
-      <w:proofErr w:type="gramStart"/>
       <w:r>
         <w:rPr>
           <w:rFonts w:eastAsia="Times New Roman" w:cs="Times New Roman"/>
@@ -22646,16 +22386,7 @@
           <w:szCs w:val="28"/>
           <w:lang w:val="en-US" w:eastAsia="ru-RU"/>
         </w:rPr>
-        <w:t>(</w:t>
-      </w:r>
-      <w:proofErr w:type="gramEnd"/>
-      <w:r>
-        <w:rPr>
-          <w:rFonts w:eastAsia="Times New Roman" w:cs="Times New Roman"/>
-          <w:szCs w:val="28"/>
-          <w:lang w:val="en-US" w:eastAsia="ru-RU"/>
-        </w:rPr>
-        <w:t xml:space="preserve">group, pageable) </w:t>
+        <w:t xml:space="preserve">(group, pageable) </w:t>
       </w:r>
       <w:r>
         <w:rPr>
@@ -22695,11 +22426,10 @@
         <w:rPr>
           <w:rFonts w:eastAsia="Times New Roman" w:cs="Times New Roman"/>
           <w:szCs w:val="28"/>
-          <w:lang w:eastAsia="ru-RU"/>
+          <w:lang w:val="en-US" w:eastAsia="ru-RU"/>
         </w:rPr>
         <w:t xml:space="preserve">? </w:t>
       </w:r>
-      <w:proofErr w:type="gramStart"/>
       <w:r>
         <w:rPr>
           <w:rFonts w:eastAsia="Times New Roman" w:cs="Times New Roman"/>
@@ -22712,34 +22442,41 @@
         <w:rPr>
           <w:rFonts w:eastAsia="Times New Roman" w:cs="Times New Roman"/>
           <w:szCs w:val="28"/>
-          <w:lang w:eastAsia="ru-RU"/>
-        </w:rPr>
-        <w:t>?.</w:t>
-      </w:r>
-      <w:proofErr w:type="gramEnd"/>
-      <w:r>
-        <w:rPr>
-          <w:rFonts w:eastAsia="Times New Roman" w:cs="Times New Roman"/>
-          <w:szCs w:val="28"/>
-          <w:lang w:eastAsia="ru-RU"/>
+          <w:lang w:val="en-US" w:eastAsia="ru-RU"/>
+        </w:rPr>
+        <w:t xml:space="preserve">?. </w:t>
+      </w:r>
+      <w:proofErr w:type="spellStart"/>
+      <w:r>
+        <w:rPr>
+          <w:rFonts w:eastAsia="Times New Roman" w:cs="Times New Roman"/>
+          <w:szCs w:val="28"/>
+          <w:lang w:eastAsia="ru-RU"/>
+        </w:rPr>
+        <w:t>Эндпоинты</w:t>
+      </w:r>
+      <w:proofErr w:type="spellEnd"/>
+      <w:r>
+        <w:rPr>
+          <w:rFonts w:eastAsia="Times New Roman" w:cs="Times New Roman"/>
+          <w:szCs w:val="28"/>
+          <w:lang w:val="en-US" w:eastAsia="ru-RU"/>
         </w:rPr>
         <w:t xml:space="preserve"> </w:t>
       </w:r>
-      <w:proofErr w:type="spellStart"/>
-      <w:r>
-        <w:rPr>
-          <w:rFonts w:eastAsia="Times New Roman" w:cs="Times New Roman"/>
-          <w:szCs w:val="28"/>
-          <w:lang w:eastAsia="ru-RU"/>
-        </w:rPr>
-        <w:t>Эндпоинты</w:t>
-      </w:r>
-      <w:proofErr w:type="spellEnd"/>
-      <w:r>
-        <w:rPr>
-          <w:rFonts w:eastAsia="Times New Roman" w:cs="Times New Roman"/>
-          <w:szCs w:val="28"/>
-          <w:lang w:eastAsia="ru-RU"/>
+      <w:r>
+        <w:rPr>
+          <w:rFonts w:eastAsia="Times New Roman" w:cs="Times New Roman"/>
+          <w:szCs w:val="28"/>
+          <w:lang w:eastAsia="ru-RU"/>
+        </w:rPr>
+        <w:t>списков</w:t>
+      </w:r>
+      <w:r>
+        <w:rPr>
+          <w:rFonts w:eastAsia="Times New Roman" w:cs="Times New Roman"/>
+          <w:szCs w:val="28"/>
+          <w:lang w:val="en-US" w:eastAsia="ru-RU"/>
         </w:rPr>
         <w:t xml:space="preserve"> </w:t>
       </w:r>
@@ -22749,13 +22486,13 @@
           <w:szCs w:val="28"/>
           <w:lang w:eastAsia="ru-RU"/>
         </w:rPr>
-        <w:t>списков</w:t>
-      </w:r>
-      <w:r>
-        <w:rPr>
-          <w:rFonts w:eastAsia="Times New Roman" w:cs="Times New Roman"/>
-          <w:szCs w:val="28"/>
-          <w:lang w:eastAsia="ru-RU"/>
+        <w:t>поддерживают</w:t>
+      </w:r>
+      <w:r>
+        <w:rPr>
+          <w:rFonts w:eastAsia="Times New Roman" w:cs="Times New Roman"/>
+          <w:szCs w:val="28"/>
+          <w:lang w:val="en-US" w:eastAsia="ru-RU"/>
         </w:rPr>
         <w:t xml:space="preserve"> </w:t>
       </w:r>
@@ -22763,22 +22500,6 @@
         <w:rPr>
           <w:rFonts w:eastAsia="Times New Roman" w:cs="Times New Roman"/>
           <w:szCs w:val="28"/>
-          <w:lang w:eastAsia="ru-RU"/>
-        </w:rPr>
-        <w:t>поддерживают</w:t>
-      </w:r>
-      <w:r>
-        <w:rPr>
-          <w:rFonts w:eastAsia="Times New Roman" w:cs="Times New Roman"/>
-          <w:szCs w:val="28"/>
-          <w:lang w:eastAsia="ru-RU"/>
-        </w:rPr>
-        <w:t xml:space="preserve"> </w:t>
-      </w:r>
-      <w:r>
-        <w:rPr>
-          <w:rFonts w:eastAsia="Times New Roman" w:cs="Times New Roman"/>
-          <w:szCs w:val="28"/>
           <w:lang w:val="en-US" w:eastAsia="ru-RU"/>
         </w:rPr>
         <w:t>Pageable</w:t>
@@ -22787,7 +22508,7 @@
         <w:rPr>
           <w:rFonts w:eastAsia="Times New Roman" w:cs="Times New Roman"/>
           <w:szCs w:val="28"/>
-          <w:lang w:eastAsia="ru-RU"/>
+          <w:lang w:val="en-US" w:eastAsia="ru-RU"/>
         </w:rPr>
         <w:t xml:space="preserve"> (</w:t>
       </w:r>
@@ -22803,7 +22524,7 @@
         <w:rPr>
           <w:rFonts w:eastAsia="Times New Roman" w:cs="Times New Roman"/>
           <w:szCs w:val="28"/>
-          <w:lang w:eastAsia="ru-RU"/>
+          <w:lang w:val="en-US" w:eastAsia="ru-RU"/>
         </w:rPr>
         <w:t xml:space="preserve">, </w:t>
       </w:r>
@@ -22819,7 +22540,7 @@
         <w:rPr>
           <w:rFonts w:eastAsia="Times New Roman" w:cs="Times New Roman"/>
           <w:szCs w:val="28"/>
-          <w:lang w:eastAsia="ru-RU"/>
+          <w:lang w:val="en-US" w:eastAsia="ru-RU"/>
         </w:rPr>
         <w:t xml:space="preserve">, </w:t>
       </w:r>
@@ -22835,7 +22556,7 @@
         <w:rPr>
           <w:rFonts w:eastAsia="Times New Roman" w:cs="Times New Roman"/>
           <w:szCs w:val="28"/>
-          <w:lang w:eastAsia="ru-RU"/>
+          <w:lang w:val="en-US" w:eastAsia="ru-RU"/>
         </w:rPr>
         <w:t xml:space="preserve">). </w:t>
       </w:r>
@@ -22877,7 +22598,7 @@
         <w:rPr>
           <w:rFonts w:eastAsia="Times New Roman" w:cs="Times New Roman"/>
           <w:szCs w:val="28"/>
-          <w:lang w:eastAsia="ru-RU"/>
+          <w:lang w:val="en-US" w:eastAsia="ru-RU"/>
         </w:rPr>
         <w:t xml:space="preserve"> </w:t>
       </w:r>
@@ -22893,12 +22614,11 @@
         <w:rPr>
           <w:rFonts w:eastAsia="Times New Roman" w:cs="Times New Roman"/>
           <w:szCs w:val="28"/>
-          <w:lang w:eastAsia="ru-RU"/>
+          <w:lang w:val="en-US" w:eastAsia="ru-RU"/>
         </w:rPr>
         <w:t xml:space="preserve"> (</w:t>
       </w:r>
       <w:proofErr w:type="spellStart"/>
-      <w:proofErr w:type="gramStart"/>
       <w:r>
         <w:rPr>
           <w:rFonts w:eastAsia="Times New Roman" w:cs="Times New Roman"/>
@@ -22907,16 +22627,14 @@
         </w:rPr>
         <w:t>ru</w:t>
       </w:r>
-      <w:proofErr w:type="spellEnd"/>
-      <w:r>
-        <w:rPr>
-          <w:rFonts w:eastAsia="Times New Roman" w:cs="Times New Roman"/>
-          <w:szCs w:val="28"/>
-          <w:lang w:eastAsia="ru-RU"/>
+      <w:r>
+        <w:rPr>
+          <w:rFonts w:eastAsia="Times New Roman" w:cs="Times New Roman"/>
+          <w:szCs w:val="28"/>
+          <w:lang w:val="en-US" w:eastAsia="ru-RU"/>
         </w:rPr>
         <w:t>.</w:t>
       </w:r>
-      <w:proofErr w:type="spellStart"/>
       <w:r>
         <w:rPr>
           <w:rFonts w:eastAsia="Times New Roman" w:cs="Times New Roman"/>
@@ -22925,13 +22643,11 @@
         </w:rPr>
         <w:t>denis</w:t>
       </w:r>
-      <w:proofErr w:type="spellEnd"/>
-      <w:proofErr w:type="gramEnd"/>
-      <w:r>
-        <w:rPr>
-          <w:rFonts w:eastAsia="Times New Roman" w:cs="Times New Roman"/>
-          <w:szCs w:val="28"/>
-          <w:lang w:eastAsia="ru-RU"/>
+      <w:r>
+        <w:rPr>
+          <w:rFonts w:eastAsia="Times New Roman" w:cs="Times New Roman"/>
+          <w:szCs w:val="28"/>
+          <w:lang w:val="en-US" w:eastAsia="ru-RU"/>
         </w:rPr>
         <w:t>.</w:t>
       </w:r>
@@ -22947,7 +22663,7 @@
         <w:rPr>
           <w:rFonts w:eastAsia="Times New Roman" w:cs="Times New Roman"/>
           <w:szCs w:val="28"/>
-          <w:lang w:eastAsia="ru-RU"/>
+          <w:lang w:val="en-US" w:eastAsia="ru-RU"/>
         </w:rPr>
         <w:t>.</w:t>
       </w:r>
@@ -22959,11 +22675,12 @@
         </w:rPr>
         <w:t>Control</w:t>
       </w:r>
-      <w:r>
-        <w:rPr>
-          <w:rFonts w:eastAsia="Times New Roman" w:cs="Times New Roman"/>
-          <w:szCs w:val="28"/>
-          <w:lang w:eastAsia="ru-RU"/>
+      <w:proofErr w:type="spellEnd"/>
+      <w:r>
+        <w:rPr>
+          <w:rFonts w:eastAsia="Times New Roman" w:cs="Times New Roman"/>
+          <w:szCs w:val="28"/>
+          <w:lang w:val="en-US" w:eastAsia="ru-RU"/>
         </w:rPr>
         <w:t xml:space="preserve">): </w:t>
       </w:r>
@@ -22979,7 +22696,7 @@
         <w:rPr>
           <w:rFonts w:eastAsia="Times New Roman" w:cs="Times New Roman"/>
           <w:szCs w:val="28"/>
-          <w:lang w:eastAsia="ru-RU"/>
+          <w:lang w:val="en-US" w:eastAsia="ru-RU"/>
         </w:rPr>
         <w:t xml:space="preserve"> @</w:t>
       </w:r>
@@ -22997,7 +22714,7 @@
         <w:rPr>
           <w:rFonts w:eastAsia="Times New Roman" w:cs="Times New Roman"/>
           <w:szCs w:val="28"/>
-          <w:lang w:eastAsia="ru-RU"/>
+          <w:lang w:val="en-US" w:eastAsia="ru-RU"/>
         </w:rPr>
         <w:t xml:space="preserve">. </w:t>
       </w:r>
@@ -23517,7 +23234,6 @@
         </w:rPr>
         <w:t xml:space="preserve">-сборку через одноимённый плагин. Инструмент проверяет соответствие кода стандартам оформления и базовым правилам качества. Запуск выполняется командой </w:t>
       </w:r>
-      <w:proofErr w:type="gramStart"/>
       <w:r>
         <w:rPr>
           <w:lang w:eastAsia="ru-RU"/>
@@ -23531,7 +23247,6 @@
         <w:t>./</w:t>
       </w:r>
       <w:proofErr w:type="spellStart"/>
-      <w:proofErr w:type="gramEnd"/>
       <w:r>
         <w:rPr>
           <w:lang w:eastAsia="ru-RU"/>
@@ -23848,19 +23563,11 @@
         </w:rPr>
         <w:t>«</w:t>
       </w:r>
-      <w:proofErr w:type="gramStart"/>
-      <w:r>
-        <w:rPr>
-          <w:lang w:eastAsia="ru-RU"/>
-        </w:rPr>
-        <w:t>log.info(</w:t>
-      </w:r>
-      <w:proofErr w:type="gramEnd"/>
-      <w:r>
-        <w:rPr>
-          <w:lang w:eastAsia="ru-RU"/>
-        </w:rPr>
-        <w:t>)</w:t>
+      <w:r>
+        <w:rPr>
+          <w:lang w:eastAsia="ru-RU"/>
+        </w:rPr>
+        <w:t>log.info()</w:t>
       </w:r>
       <w:r>
         <w:rPr>
@@ -25211,7 +24918,6 @@
         <w:t>«</w:t>
       </w:r>
       <w:proofErr w:type="spellStart"/>
-      <w:proofErr w:type="gramStart"/>
       <w:r>
         <w:rPr>
           <w:lang w:eastAsia="ru-RU"/>
@@ -25226,7 +24932,6 @@
         <w:t>(</w:t>
       </w:r>
       <w:proofErr w:type="spellStart"/>
-      <w:proofErr w:type="gramEnd"/>
       <w:r>
         <w:rPr>
           <w:lang w:eastAsia="ru-RU"/>
@@ -25304,17 +25009,9 @@
         <w:rPr>
           <w:lang w:eastAsia="ru-RU"/>
         </w:rPr>
-        <w:t xml:space="preserve"> = ? AND </w:t>
-      </w:r>
-      <w:proofErr w:type="gramStart"/>
-      <w:r>
-        <w:rPr>
-          <w:lang w:eastAsia="ru-RU"/>
-        </w:rPr>
-        <w:t>LOWER(</w:t>
-      </w:r>
-      <w:proofErr w:type="spellStart"/>
-      <w:proofErr w:type="gramEnd"/>
+        <w:t xml:space="preserve"> = ? AND LOWER(</w:t>
+      </w:r>
+      <w:proofErr w:type="spellStart"/>
       <w:r>
         <w:rPr>
           <w:lang w:eastAsia="ru-RU"/>
@@ -30618,7 +30315,6 @@
         </w:rPr>
         <w:t>«</w:t>
       </w:r>
-      <w:proofErr w:type="gramStart"/>
       <w:r>
         <w:rPr>
           <w:lang w:val="en-US" w:eastAsia="ru-RU"/>
@@ -30637,7 +30333,6 @@
         </w:rPr>
         <w:t>servlet</w:t>
       </w:r>
-      <w:proofErr w:type="gramEnd"/>
       <w:r>
         <w:rPr>
           <w:lang w:eastAsia="ru-RU"/>
@@ -30941,21 +30636,7 @@
         <w:rPr>
           <w:lang w:eastAsia="ru-RU"/>
         </w:rPr>
-        <w:t xml:space="preserve">. Зависимость от сервиса инжектируется </w:t>
-      </w:r>
-      <w:proofErr w:type="gramStart"/>
-      <w:r>
-        <w:rPr>
-          <w:lang w:eastAsia="ru-RU"/>
-        </w:rPr>
-        <w:t>через конструктор</w:t>
-      </w:r>
-      <w:proofErr w:type="gramEnd"/>
-      <w:r>
-        <w:rPr>
-          <w:lang w:eastAsia="ru-RU"/>
-        </w:rPr>
-        <w:t xml:space="preserve"> </w:t>
+        <w:t xml:space="preserve">. Зависимость от сервиса инжектируется через конструктор </w:t>
       </w:r>
       <w:r>
         <w:rPr>
@@ -32032,7 +31713,6 @@
         </w:rPr>
         <w:t xml:space="preserve"> дополнительно покрывает фильтрацию по </w:t>
       </w:r>
-      <w:proofErr w:type="gramStart"/>
       <w:r>
         <w:rPr>
           <w:lang w:eastAsia="ru-RU"/>
@@ -32053,7 +31733,6 @@
         <w:t>groupId</w:t>
       </w:r>
       <w:proofErr w:type="spellEnd"/>
-      <w:proofErr w:type="gramEnd"/>
       <w:r>
         <w:rPr>
           <w:lang w:eastAsia="ru-RU"/>
@@ -32633,7 +32312,6 @@
         <w:t>@</w:t>
       </w:r>
       <w:proofErr w:type="spellStart"/>
-      <w:proofErr w:type="gramStart"/>
       <w:r>
         <w:rPr>
           <w:lang w:eastAsia="ru-RU"/>
@@ -32648,7 +32326,6 @@
         <w:t>(</w:t>
       </w:r>
       <w:proofErr w:type="spellStart"/>
-      <w:proofErr w:type="gramEnd"/>
       <w:r>
         <w:rPr>
           <w:lang w:eastAsia="ru-RU"/>
@@ -33429,7 +33106,6 @@
         <w:t>@</w:t>
       </w:r>
       <w:proofErr w:type="spellStart"/>
-      <w:proofErr w:type="gramStart"/>
       <w:r>
         <w:rPr>
           <w:lang w:eastAsia="ru-RU"/>
@@ -33444,7 +33120,6 @@
         <w:t>(</w:t>
       </w:r>
       <w:proofErr w:type="spellStart"/>
-      <w:proofErr w:type="gramEnd"/>
       <w:r>
         <w:rPr>
           <w:lang w:eastAsia="ru-RU"/>
@@ -33589,7 +33264,6 @@
         <w:t>«</w:t>
       </w:r>
       <w:proofErr w:type="spellStart"/>
-      <w:proofErr w:type="gramStart"/>
       <w:r>
         <w:rPr>
           <w:lang w:eastAsia="ru-RU"/>
@@ -33597,7 +33271,6 @@
         <w:t>application.yaml</w:t>
       </w:r>
       <w:proofErr w:type="spellEnd"/>
-      <w:proofErr w:type="gramEnd"/>
       <w:r>
         <w:rPr>
           <w:lang w:eastAsia="ru-RU"/>
@@ -33749,7 +33422,6 @@
         </w:rPr>
         <w:t xml:space="preserve"> недоступен. Это позволяет выполнять </w:t>
       </w:r>
-      <w:proofErr w:type="gramStart"/>
       <w:r>
         <w:rPr>
           <w:lang w:eastAsia="ru-RU"/>
@@ -33763,7 +33435,6 @@
         <w:t>./</w:t>
       </w:r>
       <w:proofErr w:type="spellStart"/>
-      <w:proofErr w:type="gramEnd"/>
       <w:r>
         <w:rPr>
           <w:lang w:eastAsia="ru-RU"/>
@@ -35707,7 +35378,6 @@
         </w:rPr>
         <w:t xml:space="preserve"> сертификат, HTTP</w:t>
       </w:r>
-      <w:proofErr w:type="gramStart"/>
       <w:r>
         <w:rPr>
           <w:rFonts w:eastAsia="Times New Roman" w:cs="Times New Roman"/>
@@ -35722,16 +35392,7 @@
           <w:szCs w:val="28"/>
           <w:lang w:eastAsia="ru-RU"/>
         </w:rPr>
-        <w:t>HTTPS</w:t>
-      </w:r>
-      <w:proofErr w:type="gramEnd"/>
-      <w:r>
-        <w:rPr>
-          <w:rFonts w:eastAsia="Times New Roman" w:cs="Times New Roman"/>
-          <w:szCs w:val="28"/>
-          <w:lang w:eastAsia="ru-RU"/>
-        </w:rPr>
-        <w:t xml:space="preserve">). Данные </w:t>
+        <w:t xml:space="preserve">HTTPS). Данные </w:t>
       </w:r>
       <w:proofErr w:type="spellStart"/>
       <w:r>
@@ -36259,7 +35920,6 @@
         <w:t>src</w:t>
       </w:r>
       <w:proofErr w:type="spellEnd"/>
-      <w:proofErr w:type="gramStart"/>
       <w:r>
         <w:rPr>
           <w:lang w:eastAsia="ru-RU"/>
@@ -36274,7 +35934,6 @@
         <w:t>env</w:t>
       </w:r>
       <w:proofErr w:type="spellEnd"/>
-      <w:proofErr w:type="gramEnd"/>
       <w:r>
         <w:rPr>
           <w:lang w:eastAsia="ru-RU"/>
@@ -36697,7 +36356,6 @@
         </w:rPr>
         <w:t xml:space="preserve"> сертификате </w:t>
       </w:r>
-      <w:proofErr w:type="gramStart"/>
       <w:r>
         <w:rPr>
           <w:lang w:eastAsia="ru-RU"/>
@@ -36708,14 +36366,7 @@
         <w:rPr>
           <w:lang w:eastAsia="ru-RU"/>
         </w:rPr>
-        <w:t xml:space="preserve"> это</w:t>
-      </w:r>
-      <w:proofErr w:type="gramEnd"/>
-      <w:r>
-        <w:rPr>
-          <w:lang w:eastAsia="ru-RU"/>
-        </w:rPr>
-        <w:t xml:space="preserve"> ожидаемо. Для продолжения: в </w:t>
+        <w:t xml:space="preserve"> это ожидаемо. Для продолжения: в </w:t>
       </w:r>
       <w:proofErr w:type="spellStart"/>
       <w:r>
@@ -37343,7 +36994,6 @@
         <w:t>src</w:t>
       </w:r>
       <w:proofErr w:type="spellEnd"/>
-      <w:proofErr w:type="gramStart"/>
       <w:r>
         <w:rPr>
           <w:rFonts w:eastAsia="Times New Roman" w:cs="Times New Roman"/>
@@ -37362,7 +37012,6 @@
         <w:t>env</w:t>
       </w:r>
       <w:proofErr w:type="spellEnd"/>
-      <w:proofErr w:type="gramEnd"/>
       <w:r>
         <w:rPr>
           <w:rFonts w:eastAsia="Times New Roman" w:cs="Times New Roman"/>
@@ -54587,7 +54236,7 @@
 </file>
 
 <file path=customXml/itemProps1.xml><?xml version="1.0" encoding="utf-8"?>
-<ds:datastoreItem xmlns:ds="http://schemas.openxmlformats.org/officeDocument/2006/customXml" ds:itemID="{E767F298-AB8E-4807-A1F2-BCEBA171FFAD}">
+<ds:datastoreItem xmlns:ds="http://schemas.openxmlformats.org/officeDocument/2006/customXml" ds:itemID="{1079AF63-0B04-455B-99FD-118D1A7BF4D4}">
   <ds:schemaRefs>
     <ds:schemaRef ds:uri="http://schemas.openxmlformats.org/officeDocument/2006/bibliography"/>
   </ds:schemaRefs>

</xml_diff>